<commit_message>
Fill group PRNs, Semester VII and internal guide on the report
Add Akhil Chivukula (26070126009) and Khurinji Malar (23070126059),
keep Sukhada Dhingra (24070126505) and Dipti Kothari (23070126040),
set Semester VII and internal guide Dr. Nivedita Mishra.

Co-authored-by: sukhada dhingra <Sukhxdx@users.noreply.github.com>
</commit_message>
<xml_diff>
--- a/documentation/BTech_Project_Monthly_Progress_Report_September_2026.docx
+++ b/documentation/BTech_Project_Monthly_Progress_Report_September_2026.docx
@@ -49,7 +49,7 @@
     </w:p>
     <w:p>
       <w:pPr>
-        <w:spacing w:after="320" w:before="0" w:line="276" w:lineRule="auto"/>
+        <w:spacing w:after="160" w:before="0" w:line="276" w:lineRule="auto"/>
         <w:jc w:val="center"/>
       </w:pPr>
       <w:r>
@@ -64,7 +64,22 @@
     </w:p>
     <w:p>
       <w:pPr>
-        <w:spacing w:after="200" w:before="0" w:line="276" w:lineRule="auto"/>
+        <w:spacing w:after="320" w:before="0" w:line="276" w:lineRule="auto"/>
+        <w:jc w:val="center"/>
+      </w:pPr>
+      <w:r>
+        <w:rPr>
+          <w:rFonts w:ascii="Times New Roman" w:hAnsi="Times New Roman" w:eastAsia="Times New Roman"/>
+          <w:b/>
+          <w:i w:val="0"/>
+          <w:sz w:val="24"/>
+        </w:rPr>
+        <w:t>Semester VII  |  B.Tech. (Artificial Intelligence and Machine Learning)</w:t>
+      </w:r>
+    </w:p>
+    <w:p>
+      <w:pPr>
+        <w:spacing w:after="160" w:before="0" w:line="276" w:lineRule="auto"/>
         <w:jc w:val="center"/>
       </w:pPr>
       <w:r>
@@ -77,102 +92,39 @@
         <w:t>Under the Guidance of</w:t>
       </w:r>
     </w:p>
-    <w:tbl>
-      <w:tblPr>
-        <w:tblW w:type="auto" w:w="0"/>
-        <w:jc w:val="center"/>
-        <w:tblLook w:firstColumn="1" w:firstRow="1" w:lastColumn="0" w:lastRow="0" w:noHBand="0" w:noVBand="1" w:val="04A0"/>
-      </w:tblPr>
-      <w:tblGrid>
-        <w:gridCol w:w="4734"/>
-        <w:gridCol w:w="4734"/>
-      </w:tblGrid>
-      <w:tr>
-        <w:tc>
-          <w:tcPr>
-            <w:tcW w:type="dxa" w:w="4734"/>
-          </w:tcPr>
-          <w:p>
-            <w:pPr>
-              <w:jc w:val="center"/>
-            </w:pPr>
-            <w:r/>
-            <w:r>
-              <w:rPr>
-                <w:rFonts w:ascii="Times New Roman" w:hAnsi="Times New Roman" w:eastAsia="Times New Roman"/>
-                <w:b/>
-                <w:i w:val="0"/>
-                <w:sz w:val="24"/>
-              </w:rPr>
-              <w:t>Dr. Sheetal Borhade</w:t>
-            </w:r>
-          </w:p>
-        </w:tc>
-        <w:tc>
-          <w:tcPr>
-            <w:tcW w:type="dxa" w:w="4734"/>
-          </w:tcPr>
-          <w:p>
-            <w:pPr>
-              <w:jc w:val="center"/>
-            </w:pPr>
-            <w:r/>
-            <w:r>
-              <w:rPr>
-                <w:rFonts w:ascii="Times New Roman" w:hAnsi="Times New Roman" w:eastAsia="Times New Roman"/>
-                <w:b/>
-                <w:i w:val="0"/>
-                <w:sz w:val="24"/>
-              </w:rPr>
-              <w:t>Dr. Zulfikar Ali Ansari</w:t>
-            </w:r>
-          </w:p>
-        </w:tc>
-      </w:tr>
-      <w:tr>
-        <w:tc>
-          <w:tcPr>
-            <w:tcW w:type="dxa" w:w="4734"/>
-          </w:tcPr>
-          <w:p>
-            <w:pPr>
-              <w:jc w:val="center"/>
-            </w:pPr>
-            <w:r>
-              <w:rPr>
-                <w:rFonts w:ascii="Times New Roman" w:hAnsi="Times New Roman" w:eastAsia="Times New Roman"/>
-                <w:b w:val="0"/>
-                <w:i/>
-                <w:sz w:val="20"/>
-              </w:rPr>
-              <w:t>(Name &amp; sign of the Co-guide)</w:t>
-            </w:r>
-          </w:p>
-        </w:tc>
-        <w:tc>
-          <w:tcPr>
-            <w:tcW w:type="dxa" w:w="4734"/>
-          </w:tcPr>
-          <w:p>
-            <w:pPr>
-              <w:jc w:val="center"/>
-            </w:pPr>
-            <w:r>
-              <w:rPr>
-                <w:rFonts w:ascii="Times New Roman" w:hAnsi="Times New Roman" w:eastAsia="Times New Roman"/>
-                <w:b w:val="0"/>
-                <w:i/>
-                <w:sz w:val="20"/>
-              </w:rPr>
-              <w:t>(Name &amp; sign of the Guide)</w:t>
-            </w:r>
-          </w:p>
-        </w:tc>
-      </w:tr>
-    </w:tbl>
     <w:p>
       <w:pPr>
-        <w:spacing w:after="160" w:before="360" w:line="276" w:lineRule="auto"/>
+        <w:spacing w:after="40" w:before="0" w:line="276" w:lineRule="auto"/>
+        <w:jc w:val="center"/>
+      </w:pPr>
+      <w:r>
+        <w:rPr>
+          <w:rFonts w:ascii="Times New Roman" w:hAnsi="Times New Roman" w:eastAsia="Times New Roman"/>
+          <w:b/>
+          <w:i w:val="0"/>
+          <w:sz w:val="28"/>
+        </w:rPr>
+        <w:t>Dr. Nivedita Mishra</w:t>
+      </w:r>
+    </w:p>
+    <w:p>
+      <w:pPr>
+        <w:spacing w:after="280" w:before="0" w:line="276" w:lineRule="auto"/>
+        <w:jc w:val="center"/>
+      </w:pPr>
+      <w:r>
+        <w:rPr>
+          <w:rFonts w:ascii="Times New Roman" w:hAnsi="Times New Roman" w:eastAsia="Times New Roman"/>
+          <w:b w:val="0"/>
+          <w:i/>
+          <w:sz w:val="22"/>
+        </w:rPr>
+        <w:t>(Internal Guide)</w:t>
+      </w:r>
+    </w:p>
+    <w:p>
+      <w:pPr>
+        <w:spacing w:after="160" w:before="160" w:line="276" w:lineRule="auto"/>
         <w:jc w:val="center"/>
       </w:pPr>
       <w:r>
@@ -193,13 +145,42 @@
         <w:tblLook w:firstColumn="1" w:firstRow="1" w:lastColumn="0" w:lastRow="0" w:noHBand="0" w:noVBand="1" w:val="04A0"/>
       </w:tblPr>
       <w:tblGrid>
-        <w:gridCol w:w="4734"/>
-        <w:gridCol w:w="4734"/>
+        <w:gridCol w:w="3156"/>
+        <w:gridCol w:w="3156"/>
+        <w:gridCol w:w="3156"/>
       </w:tblGrid>
       <w:tr>
         <w:tc>
           <w:tcPr>
-            <w:tcW w:type="dxa" w:w="5102"/>
+            <w:tcW w:type="dxa" w:w="1417"/>
+            <w:shd w:fill="1F4E79" w:val="clear"/>
+            <w:tcBorders>
+              <w:top w:val="single" w:sz="4" w:space="0" w:color="000000"/>
+              <w:left w:val="single" w:sz="4" w:space="0" w:color="000000"/>
+              <w:bottom w:val="single" w:sz="4" w:space="0" w:color="000000"/>
+              <w:right w:val="single" w:sz="4" w:space="0" w:color="000000"/>
+            </w:tcBorders>
+          </w:tcPr>
+          <w:p>
+            <w:pPr>
+              <w:jc w:val="center"/>
+            </w:pPr>
+            <w:r/>
+            <w:r>
+              <w:rPr>
+                <w:rFonts w:ascii="Times New Roman" w:hAnsi="Times New Roman" w:eastAsia="Times New Roman"/>
+                <w:b/>
+                <w:i w:val="0"/>
+                <w:color w:val="FFFFFF"/>
+                <w:sz w:val="22"/>
+              </w:rPr>
+              <w:t>Sr. No.</w:t>
+            </w:r>
+          </w:p>
+        </w:tc>
+        <w:tc>
+          <w:tcPr>
+            <w:tcW w:type="dxa" w:w="4252"/>
             <w:shd w:fill="1F4E79" w:val="clear"/>
             <w:tcBorders>
               <w:top w:val="single" w:sz="4" w:space="0" w:color="000000"/>
@@ -227,7 +208,7 @@
         </w:tc>
         <w:tc>
           <w:tcPr>
-            <w:tcW w:type="dxa" w:w="3969"/>
+            <w:tcW w:type="dxa" w:w="3402"/>
             <w:shd w:fill="1F4E79" w:val="clear"/>
             <w:tcBorders>
               <w:top w:val="single" w:sz="4" w:space="0" w:color="000000"/>
@@ -257,7 +238,34 @@
       <w:tr>
         <w:tc>
           <w:tcPr>
-            <w:tcW w:type="dxa" w:w="5102"/>
+            <w:tcW w:type="dxa" w:w="1417"/>
+            <w:shd w:fill="F2F2F2" w:val="clear"/>
+            <w:tcBorders>
+              <w:top w:val="single" w:sz="4" w:space="0" w:color="000000"/>
+              <w:left w:val="single" w:sz="4" w:space="0" w:color="000000"/>
+              <w:bottom w:val="single" w:sz="4" w:space="0" w:color="000000"/>
+              <w:right w:val="single" w:sz="4" w:space="0" w:color="000000"/>
+            </w:tcBorders>
+          </w:tcPr>
+          <w:p>
+            <w:pPr>
+              <w:jc w:val="left"/>
+            </w:pPr>
+            <w:r/>
+            <w:r>
+              <w:rPr>
+                <w:rFonts w:ascii="Times New Roman" w:hAnsi="Times New Roman" w:eastAsia="Times New Roman"/>
+                <w:b w:val="0"/>
+                <w:i w:val="0"/>
+                <w:sz w:val="22"/>
+              </w:rPr>
+              <w:t>1</w:t>
+            </w:r>
+          </w:p>
+        </w:tc>
+        <w:tc>
+          <w:tcPr>
+            <w:tcW w:type="dxa" w:w="4252"/>
             <w:shd w:fill="F2F2F2" w:val="clear"/>
             <w:tcBorders>
               <w:top w:val="single" w:sz="4" w:space="0" w:color="000000"/>
@@ -284,7 +292,7 @@
         </w:tc>
         <w:tc>
           <w:tcPr>
-            <w:tcW w:type="dxa" w:w="3969"/>
+            <w:tcW w:type="dxa" w:w="3402"/>
             <w:shd w:fill="F2F2F2" w:val="clear"/>
             <w:tcBorders>
               <w:top w:val="single" w:sz="4" w:space="0" w:color="000000"/>
@@ -313,7 +321,34 @@
       <w:tr>
         <w:tc>
           <w:tcPr>
-            <w:tcW w:type="dxa" w:w="5102"/>
+            <w:tcW w:type="dxa" w:w="1417"/>
+            <w:shd w:fill="FFFFFF" w:val="clear"/>
+            <w:tcBorders>
+              <w:top w:val="single" w:sz="4" w:space="0" w:color="000000"/>
+              <w:left w:val="single" w:sz="4" w:space="0" w:color="000000"/>
+              <w:bottom w:val="single" w:sz="4" w:space="0" w:color="000000"/>
+              <w:right w:val="single" w:sz="4" w:space="0" w:color="000000"/>
+            </w:tcBorders>
+          </w:tcPr>
+          <w:p>
+            <w:pPr>
+              <w:jc w:val="left"/>
+            </w:pPr>
+            <w:r/>
+            <w:r>
+              <w:rPr>
+                <w:rFonts w:ascii="Times New Roman" w:hAnsi="Times New Roman" w:eastAsia="Times New Roman"/>
+                <w:b w:val="0"/>
+                <w:i w:val="0"/>
+                <w:sz w:val="22"/>
+              </w:rPr>
+              <w:t>2</w:t>
+            </w:r>
+          </w:p>
+        </w:tc>
+        <w:tc>
+          <w:tcPr>
+            <w:tcW w:type="dxa" w:w="4252"/>
             <w:shd w:fill="FFFFFF" w:val="clear"/>
             <w:tcBorders>
               <w:top w:val="single" w:sz="4" w:space="0" w:color="000000"/>
@@ -340,7 +375,7 @@
         </w:tc>
         <w:tc>
           <w:tcPr>
-            <w:tcW w:type="dxa" w:w="3969"/>
+            <w:tcW w:type="dxa" w:w="3402"/>
             <w:shd w:fill="FFFFFF" w:val="clear"/>
             <w:tcBorders>
               <w:top w:val="single" w:sz="4" w:space="0" w:color="000000"/>
@@ -369,7 +404,34 @@
       <w:tr>
         <w:tc>
           <w:tcPr>
-            <w:tcW w:type="dxa" w:w="5102"/>
+            <w:tcW w:type="dxa" w:w="1417"/>
+            <w:shd w:fill="F2F2F2" w:val="clear"/>
+            <w:tcBorders>
+              <w:top w:val="single" w:sz="4" w:space="0" w:color="000000"/>
+              <w:left w:val="single" w:sz="4" w:space="0" w:color="000000"/>
+              <w:bottom w:val="single" w:sz="4" w:space="0" w:color="000000"/>
+              <w:right w:val="single" w:sz="4" w:space="0" w:color="000000"/>
+            </w:tcBorders>
+          </w:tcPr>
+          <w:p>
+            <w:pPr>
+              <w:jc w:val="left"/>
+            </w:pPr>
+            <w:r/>
+            <w:r>
+              <w:rPr>
+                <w:rFonts w:ascii="Times New Roman" w:hAnsi="Times New Roman" w:eastAsia="Times New Roman"/>
+                <w:b w:val="0"/>
+                <w:i w:val="0"/>
+                <w:sz w:val="22"/>
+              </w:rPr>
+              <w:t>3</w:t>
+            </w:r>
+          </w:p>
+        </w:tc>
+        <w:tc>
+          <w:tcPr>
+            <w:tcW w:type="dxa" w:w="4252"/>
             <w:shd w:fill="F2F2F2" w:val="clear"/>
             <w:tcBorders>
               <w:top w:val="single" w:sz="4" w:space="0" w:color="000000"/>
@@ -396,7 +458,7 @@
         </w:tc>
         <w:tc>
           <w:tcPr>
-            <w:tcW w:type="dxa" w:w="3969"/>
+            <w:tcW w:type="dxa" w:w="3402"/>
             <w:shd w:fill="F2F2F2" w:val="clear"/>
             <w:tcBorders>
               <w:top w:val="single" w:sz="4" w:space="0" w:color="000000"/>
@@ -417,7 +479,7 @@
                 <w:i w:val="0"/>
                 <w:sz w:val="22"/>
               </w:rPr>
-              <w:t>________________</w:t>
+              <w:t>23070126059</w:t>
             </w:r>
           </w:p>
         </w:tc>
@@ -425,7 +487,7 @@
       <w:tr>
         <w:tc>
           <w:tcPr>
-            <w:tcW w:type="dxa" w:w="5102"/>
+            <w:tcW w:type="dxa" w:w="1417"/>
             <w:shd w:fill="FFFFFF" w:val="clear"/>
             <w:tcBorders>
               <w:top w:val="single" w:sz="4" w:space="0" w:color="000000"/>
@@ -446,13 +508,13 @@
                 <w:i w:val="0"/>
                 <w:sz w:val="22"/>
               </w:rPr>
-              <w:t>Akhil</w:t>
+              <w:t>4</w:t>
             </w:r>
           </w:p>
         </w:tc>
         <w:tc>
           <w:tcPr>
-            <w:tcW w:type="dxa" w:w="3969"/>
+            <w:tcW w:type="dxa" w:w="4252"/>
             <w:shd w:fill="FFFFFF" w:val="clear"/>
             <w:tcBorders>
               <w:top w:val="single" w:sz="4" w:space="0" w:color="000000"/>
@@ -473,7 +535,34 @@
                 <w:i w:val="0"/>
                 <w:sz w:val="22"/>
               </w:rPr>
-              <w:t>________________</w:t>
+              <w:t>Akhil Chivukula</w:t>
+            </w:r>
+          </w:p>
+        </w:tc>
+        <w:tc>
+          <w:tcPr>
+            <w:tcW w:type="dxa" w:w="3402"/>
+            <w:shd w:fill="FFFFFF" w:val="clear"/>
+            <w:tcBorders>
+              <w:top w:val="single" w:sz="4" w:space="0" w:color="000000"/>
+              <w:left w:val="single" w:sz="4" w:space="0" w:color="000000"/>
+              <w:bottom w:val="single" w:sz="4" w:space="0" w:color="000000"/>
+              <w:right w:val="single" w:sz="4" w:space="0" w:color="000000"/>
+            </w:tcBorders>
+          </w:tcPr>
+          <w:p>
+            <w:pPr>
+              <w:jc w:val="left"/>
+            </w:pPr>
+            <w:r/>
+            <w:r>
+              <w:rPr>
+                <w:rFonts w:ascii="Times New Roman" w:hAnsi="Times New Roman" w:eastAsia="Times New Roman"/>
+                <w:b w:val="0"/>
+                <w:i w:val="0"/>
+                <w:sz w:val="22"/>
+              </w:rPr>
+              <w:t>26070126009</w:t>
             </w:r>
           </w:p>
         </w:tc>
@@ -481,22 +570,7 @@
     </w:tbl>
     <w:p>
       <w:pPr>
-        <w:spacing w:after="320" w:before="120" w:line="276" w:lineRule="auto"/>
-        <w:jc w:val="center"/>
-      </w:pPr>
-      <w:r>
-        <w:rPr>
-          <w:rFonts w:ascii="Times New Roman" w:hAnsi="Times New Roman" w:eastAsia="Times New Roman"/>
-          <w:b w:val="0"/>
-          <w:i/>
-          <w:sz w:val="20"/>
-        </w:rPr>
-        <w:t>Khurinji Malar and Akhil: fill PRN before final upload.</w:t>
-      </w:r>
-    </w:p>
-    <w:p>
-      <w:pPr>
-        <w:spacing w:after="80" w:before="200" w:line="276" w:lineRule="auto"/>
+        <w:spacing w:after="80" w:before="360" w:line="276" w:lineRule="auto"/>
         <w:jc w:val="center"/>
       </w:pPr>
       <w:r>
@@ -2409,7 +2483,7 @@
               </w:rPr>
               <w:t>Khurinji Malar</w:t>
               <w:br/>
-              <w:t>PRN ________</w:t>
+              <w:t>PRN 23070126059</w:t>
             </w:r>
           </w:p>
         </w:tc>
@@ -2492,9 +2566,9 @@
                 <w:i w:val="0"/>
                 <w:sz w:val="18"/>
               </w:rPr>
-              <w:t>Akhil</w:t>
+              <w:t>Akhil Chivukula</w:t>
               <w:br/>
-              <w:t>PRN ________</w:t>
+              <w:t>PRN 26070126009</w:t>
             </w:r>
           </w:p>
         </w:tc>
@@ -2615,7 +2689,7 @@
           <w:i w:val="0"/>
           <w:sz w:val="24"/>
         </w:rPr>
-        <w:t>Our group is working on a controlled prototype for the Multimodal AI course / B.Tech. project. The task is binary: decide whether a post is REAL or FAKE using the image and the caption. REAL samples use a caption that matches the image. FAKE samples use a sensational caption, an image–text mismatch, or both. Five models are compared: image-only CNN, text-only BiGRU, early fusion, late fusion and hybrid fusion.</w:t>
+        <w:t>Our group is working on this as the Semester VII B.Tech. project in AIML, under the internal guidance of Dr. Nivedita Mishra. The task is binary: decide whether a post is REAL or FAKE using the image and the caption. REAL samples use a caption that matches the image. FAKE samples use a sensational caption, an image–text mismatch, or both. Five models are compared: image-only CNN, text-only BiGRU, early fusion, late fusion and hybrid fusion.</w:t>
       </w:r>
     </w:p>
     <w:p>
@@ -9545,7 +9619,7 @@
           <w:i w:val="0"/>
           <w:sz w:val="24"/>
         </w:rPr>
-        <w:t>Sukhada Dhingra _____________     Dipti Kothari _____________</w:t>
+        <w:t>Sukhada Dhingra (24070126505) _____________     Dipti Kothari (23070126040) _____________</w:t>
       </w:r>
     </w:p>
     <w:p>
@@ -9560,7 +9634,7 @@
           <w:i w:val="0"/>
           <w:sz w:val="24"/>
         </w:rPr>
-        <w:t>Khurinji Malar _____________     Akhil _____________</w:t>
+        <w:t>Khurinji Malar (23070126059) _____________     Akhil Chivukula (26070126009) _____________</w:t>
       </w:r>
     </w:p>
     <w:sectPr>

</xml_diff>